<commit_message>
Bloque 1 y 2 completos
kendall & kendall (Bloque 1)
bloque 2 y bloque 3
</commit_message>
<xml_diff>
--- a/ActividadesWord/FasesKendall.docx
+++ b/ActividadesWord/FasesKendall.docx
@@ -5,10 +5,14 @@
     <w:p>
       <w:pPr>
         <w:pStyle w:val="Normal"/>
-        <w:rPr/>
-      </w:pPr>
-      <w:r>
-        <w:rPr/>
+        <w:rPr>
+          <w:u w:val="none"/>
+        </w:rPr>
+      </w:pPr>
+      <w:r>
+        <w:rPr>
+          <w:u w:val="none"/>
+        </w:rPr>
         <mc:AlternateContent>
           <mc:Choice Requires="wps">
             <w:drawing>
@@ -20,7 +24,7 @@
                 <wp:positionV relativeFrom="page">
                   <wp:posOffset>213360</wp:posOffset>
                 </wp:positionV>
-                <wp:extent cx="5343525" cy="10442575"/>
+                <wp:extent cx="5335270" cy="10416540"/>
                 <wp:effectExtent l="0" t="0" r="8890" b="2540"/>
                 <wp:wrapNone/>
                 <wp:docPr id="1" name="Rectángulo 16"/>
@@ -31,7 +35,7 @@
                       <wps:spPr>
                         <a:xfrm>
                           <a:off x="0" y="0"/>
-                          <a:ext cx="5342760" cy="10441800"/>
+                          <a:ext cx="5334480" cy="10415880"/>
                         </a:xfrm>
                         <a:prstGeom prst="rect">
                           <a:avLst/>
@@ -62,22 +66,15 @@
                                 <w:szCs w:val="80"/>
                               </w:rPr>
                             </w:pPr>
-                            <w:sdt>
-                              <w:sdtPr>
-                                <w:alias w:val="Título"/>
-                              </w:sdtPr>
-                              <w:sdtContent>
-                                <w:r>
-                                  <w:rPr>
-                                    <w:caps/>
-                                    <w:color w:val="FFFFFF" w:themeColor="background1"/>
-                                    <w:sz w:val="80"/>
-                                    <w:szCs w:val="80"/>
-                                  </w:rPr>
-                                  <w:t>Las 7 Fases de Kendall &amp; kendall</w:t>
-                                </w:r>
-                              </w:sdtContent>
-                            </w:sdt>
+                            <w:r>
+                              <w:rPr>
+                                <w:caps/>
+                                <w:color w:val="FFFFFF" w:themeColor="background1"/>
+                                <w:sz w:val="80"/>
+                                <w:szCs w:val="80"/>
+                              </w:rPr>
+                              <w:t>Las 7 Fases de Kendall &amp; kendall</w:t>
+                            </w:r>
                           </w:p>
                           <w:p>
                             <w:pPr>
@@ -99,9 +96,9 @@
                           <w:sdt>
                             <w:sdtPr>
                               <w:text/>
-                              <w:id w:val="598396513"/>
+                              <w:id w:val="1217569665"/>
                               <w:dataBinding w:prefixMappings="xmlns:ns0='http://schemas.microsoft.com/office/2006/coverPageProps'" w:xpath="/ns0:CoverPageProperties[1]/ns0:Abstract[1]" w:storeItemID="{55AF091B-3C7A-41E3-B477-F2FDAA23CFDA}"/>
-                              <w:alias w:val="Descripción breve"/>
+                              <w:alias w:val="Título"/>
                             </w:sdtPr>
                             <w:sdtContent>
                               <w:p>
@@ -143,7 +140,7 @@
           </mc:Choice>
           <mc:Fallback>
             <w:pict>
-              <v:rect id="shape_0" ID="Rectángulo 16" fillcolor="#4472c4" stroked="f" style="position:absolute;margin-left:11.9pt;margin-top:16.8pt;width:420.65pt;height:822.15pt;mso-position-horizontal-relative:page;mso-position-vertical-relative:page" wp14:anchorId="0EA06E39">
+              <v:rect id="shape_0" ID="Rectángulo 16" fillcolor="#4472c4" stroked="f" style="position:absolute;margin-left:11.9pt;margin-top:16.8pt;width:420pt;height:820.1pt;mso-position-horizontal-relative:page;mso-position-vertical-relative:page" wp14:anchorId="0EA06E39">
                 <w10:wrap type="square"/>
                 <v:fill o:detectmouseclick="t" type="solid" color2="#bb8d3b"/>
                 <v:stroke color="#3465a4" joinstyle="round" endcap="flat"/>
@@ -160,24 +157,15 @@
                           <w:szCs w:val="80"/>
                         </w:rPr>
                       </w:pPr>
-                      <w:sdt>
-                        <w:sdtPr>
-                          <w:text/>
-                          <w:dataBinding w:prefixMappings="xmlns:ns0='http://schemas.openxmlformats.org/package/2006/metadata/core-properties' xmlns:ns1='http://purl.org/dc/elements/1.1/'" w:xpath="/ns0:coreProperties[1]/ns1:title[1]" w:storeItemID="{6C3C8BC8-F283-45AE-878A-BAB7291924A1}"/>
-                          <w:alias w:val="Título"/>
-                        </w:sdtPr>
-                        <w:sdtContent>
-                          <w:r>
-                            <w:rPr>
-                              <w:caps/>
-                              <w:color w:val="FFFFFF" w:themeColor="background1"/>
-                              <w:sz w:val="80"/>
-                              <w:szCs w:val="80"/>
-                            </w:rPr>
-                            <w:t>Las 7 Fases de Kendall &amp; kendall</w:t>
-                          </w:r>
-                        </w:sdtContent>
-                      </w:sdt>
+                      <w:r>
+                        <w:rPr>
+                          <w:caps/>
+                          <w:color w:val="FFFFFF" w:themeColor="background1"/>
+                          <w:sz w:val="80"/>
+                          <w:szCs w:val="80"/>
+                        </w:rPr>
+                        <w:t>Las 7 Fases de Kendall &amp; kendall</w:t>
+                      </w:r>
                     </w:p>
                     <w:p>
                       <w:pPr>
@@ -199,9 +187,9 @@
                     <w:sdt>
                       <w:sdtPr>
                         <w:text/>
-                        <w:id w:val="1259379129"/>
+                        <w:id w:val="1435128259"/>
                         <w:dataBinding w:prefixMappings="xmlns:ns0='http://schemas.microsoft.com/office/2006/coverPageProps'" w:xpath="/ns0:CoverPageProperties[1]/ns0:Abstract[1]" w:storeItemID="{55AF091B-3C7A-41E3-B477-F2FDAA23CFDA}"/>
-                        <w:alias w:val="Descripción breve"/>
+                        <w:alias w:val="Título"/>
                       </w:sdtPr>
                       <w:sdtContent>
                         <w:p>
@@ -241,7 +229,7 @@
                 <wp:positionV relativeFrom="page">
                   <wp:align>center</wp:align>
                 </wp:positionV>
-                <wp:extent cx="1858645" cy="10442575"/>
+                <wp:extent cx="1855470" cy="10416540"/>
                 <wp:effectExtent l="0" t="0" r="5080" b="2540"/>
                 <wp:wrapNone/>
                 <wp:docPr id="3" name="Rectángulo 472"/>
@@ -252,7 +240,7 @@
                       <wps:spPr>
                         <a:xfrm>
                           <a:off x="0" y="0"/>
-                          <a:ext cx="1857960" cy="10441800"/>
+                          <a:ext cx="1854720" cy="10415880"/>
                         </a:xfrm>
                         <a:prstGeom prst="rect">
                           <a:avLst/>
@@ -286,20 +274,13 @@
                               <w:spacing w:before="0" w:after="160"/>
                               <w:rPr/>
                             </w:pPr>
-                            <w:sdt>
-                              <w:sdtPr>
-                                <w:alias w:val="Subtítulo"/>
-                              </w:sdtPr>
-                              <w:sdtContent>
-                                <w:r>
-                                  <w:rPr>
-                                    <w:rFonts w:cs="" w:cstheme="minorBidi"/>
-                                    <w:color w:val="FFFFFF" w:themeColor="background1"/>
-                                  </w:rPr>
-                                  <w:t>Software IV</w:t>
-                                </w:r>
-                              </w:sdtContent>
-                            </w:sdt>
+                            <w:r>
+                              <w:rPr>
+                                <w:rFonts w:cs="" w:cstheme="minorBidi"/>
+                                <w:color w:val="FFFFFF" w:themeColor="background1"/>
+                              </w:rPr>
+                              <w:t>Software IV</w:t>
+                            </w:r>
                           </w:p>
                         </w:txbxContent>
                       </wps:txbx>
@@ -321,7 +302,7 @@
           </mc:Choice>
           <mc:Fallback>
             <w:pict>
-              <v:rect id="shape_0" ID="Rectángulo 472" fillcolor="#44546a" stroked="f" style="position:absolute;margin-left:434.55pt;margin-top:9.85pt;width:146.25pt;height:822.15pt;mso-position-horizontal-relative:page;mso-position-vertical:center;mso-position-vertical-relative:page" wp14:anchorId="18A47B51">
+              <v:rect id="shape_0" ID="Rectángulo 472" fillcolor="#44546a" stroked="f" style="position:absolute;margin-left:434.55pt;margin-top:10.85pt;width:146pt;height:820.1pt;mso-position-horizontal-relative:page;mso-position-vertical:center;mso-position-vertical-relative:page" wp14:anchorId="18A47B51">
                 <w10:wrap type="square"/>
                 <v:fill o:detectmouseclick="t" type="solid" color2="#bbab95"/>
                 <v:stroke color="#3465a4" weight="12600" joinstyle="miter" endcap="flat"/>
@@ -333,22 +314,13 @@
                         <w:spacing w:before="0" w:after="160"/>
                         <w:rPr/>
                       </w:pPr>
-                      <w:sdt>
-                        <w:sdtPr>
-                          <w:text/>
-                          <w:dataBinding w:prefixMappings="xmlns:ns0='http://schemas.openxmlformats.org/package/2006/metadata/core-properties' xmlns:ns1='http://purl.org/dc/elements/1.1/'" w:xpath="/ns0:coreProperties[1]/ns1:subject[1]" w:storeItemID="{6C3C8BC8-F283-45AE-878A-BAB7291924A1}"/>
-                          <w:alias w:val="Subtítulo"/>
-                        </w:sdtPr>
-                        <w:sdtContent>
-                          <w:r>
-                            <w:rPr>
-                              <w:rFonts w:cs="" w:cstheme="minorBidi"/>
-                              <w:color w:val="FFFFFF" w:themeColor="background1"/>
-                            </w:rPr>
-                            <w:t>Software IV</w:t>
-                          </w:r>
-                        </w:sdtContent>
-                      </w:sdt>
+                      <w:r>
+                        <w:rPr>
+                          <w:rFonts w:cs="" w:cstheme="minorBidi"/>
+                          <w:color w:val="FFFFFF" w:themeColor="background1"/>
+                        </w:rPr>
+                        <w:t>Software IV</w:t>
+                      </w:r>
                     </w:p>
                   </w:txbxContent>
                 </v:textbox>
@@ -361,35 +333,66 @@
     <w:p>
       <w:pPr>
         <w:pStyle w:val="Normal"/>
+        <w:rPr>
+          <w:u w:val="none"/>
+        </w:rPr>
+      </w:pPr>
+      <w:r>
+        <w:rPr>
+          <w:u w:val="none"/>
+        </w:rPr>
+      </w:r>
+    </w:p>
+    <w:p>
+      <w:pPr>
+        <w:pStyle w:val="Normal"/>
+        <w:rPr>
+          <w:u w:val="none"/>
+        </w:rPr>
+      </w:pPr>
+      <w:r>
+        <w:rPr>
+          <w:u w:val="none"/>
+        </w:rPr>
+      </w:r>
+      <w:r>
+        <w:br w:type="page"/>
+      </w:r>
+    </w:p>
+    <w:p>
+      <w:pPr>
+        <w:pStyle w:val="Normal"/>
+        <w:bidi w:val="0"/>
+        <w:spacing w:lineRule="auto" w:line="276"/>
         <w:rPr/>
       </w:pPr>
       <w:r>
-        <w:rPr/>
-      </w:r>
-    </w:p>
-    <w:p>
-      <w:pPr>
-        <w:pStyle w:val="Normal"/>
-        <w:rPr/>
-      </w:pPr>
-      <w:r>
-        <w:rPr/>
-      </w:r>
-      <w:r>
-        <w:br w:type="page"/>
-      </w:r>
-    </w:p>
-    <w:p>
-      <w:pPr>
-        <w:pStyle w:val="Normal"/>
-        <w:spacing w:lineRule="auto" w:line="276"/>
-        <w:rPr>
-          <w:rFonts w:ascii="Times New Roman" w:hAnsi="Times New Roman" w:cs="Times New Roman"/>
+        <w:rPr>
+          <w:rFonts w:cs="Times New Roman" w:ascii="Times New Roman" w:hAnsi="Times New Roman"/>
+          <w:sz w:val="24"/>
+          <w:szCs w:val="24"/>
+          <w:u w:val="none"/>
+        </w:rPr>
+        <w:tab/>
+      </w:r>
+      <w:r>
+        <w:rPr>
+          <w:rFonts w:cs="Times New Roman" w:ascii="Times New Roman" w:hAnsi="Times New Roman"/>
           <w:sz w:val="24"/>
           <w:szCs w:val="24"/>
           <w:u w:val="single"/>
         </w:rPr>
-      </w:pPr>
+        <w:t>Bloque 1</w:t>
+      </w:r>
+      <w:r>
+        <w:rPr>
+          <w:rFonts w:cs="Times New Roman" w:ascii="Times New Roman" w:hAnsi="Times New Roman"/>
+          <w:sz w:val="24"/>
+          <w:szCs w:val="24"/>
+          <w:u w:val="none"/>
+        </w:rPr>
+        <w:t xml:space="preserve">: </w:t>
+      </w:r>
       <w:r>
         <w:rPr>
           <w:rFonts w:cs="Times New Roman" w:ascii="Times New Roman" w:hAnsi="Times New Roman"/>
@@ -654,13 +657,7 @@
         <w:rPr>
           <w:rFonts w:cs="Times New Roman" w:ascii="Times New Roman" w:hAnsi="Times New Roman"/>
         </w:rPr>
-        <w:t xml:space="preserve">: En esta etapa debemos tener en cuenta todos los datos recopilados en las fases anteriores para poder interpretar el sistema de la forma que el cliente lo pensó, teniendo en cuenta la totalidad de sus necesidades. Si el analista interpreta incorrectamente los deseos del cliente para el sistema no va a cumplir con los requisitos y solo va a permitir la venta de productos, </w:t>
-      </w:r>
-      <w:r>
-        <w:rPr>
-          <w:rFonts w:cs="Times New Roman" w:ascii="Times New Roman" w:hAnsi="Times New Roman"/>
-        </w:rPr>
-        <w:t>lo que va a provocar que, mas adelante, cuando se detecte la inconsistencia se tenga que volver a la fase 3 del desarrollo.</w:t>
+        <w:t>: En esta etapa debemos tener en cuenta todos los datos recopilados en las fases anteriores para poder interpretar el sistema de la forma que el cliente lo pensó, teniendo en cuenta la totalidad de sus necesidades. Si el analista interpreta incorrectamente los deseos del cliente para el sistema no va a cumplir con los requisitos y solo va a permitir la venta de productos, lo que va a provocar que, mas adelante, cuando se detecte la inconsistencia se tenga que volver a la fase 3 del desarrollo.</w:t>
       </w:r>
     </w:p>
     <w:p>
@@ -1095,13 +1092,7 @@
         <w:rPr>
           <w:rFonts w:cs="Times New Roman" w:ascii="Times New Roman" w:hAnsi="Times New Roman"/>
         </w:rPr>
-        <w:t xml:space="preserve">: </w:t>
-      </w:r>
-      <w:r>
-        <w:rPr>
-          <w:rFonts w:cs="Times New Roman" w:ascii="Times New Roman" w:hAnsi="Times New Roman"/>
-        </w:rPr>
-        <w:t>Se pone en funcionamiento el sistema, se capacitan a los usuarios para que puedan utilizarlo, y se llevan a cabo revisiones finales para asegurar que cumpla con los requerimientos del cliente junto a documentación del rendimiento.</w:t>
+        <w:t>: Se pone en funcionamiento el sistema, se capacitan a los usuarios para que puedan utilizarlo, y se llevan a cabo revisiones finales para asegurar que cumpla con los requerimientos del cliente junto a documentación del rendimiento.</w:t>
       </w:r>
     </w:p>
     <w:p>
@@ -1149,13 +1140,7 @@
         <w:rPr>
           <w:rFonts w:cs="Times New Roman" w:ascii="Times New Roman" w:hAnsi="Times New Roman"/>
         </w:rPr>
-        <w:t xml:space="preserve">. </w:t>
-      </w:r>
-      <w:r>
-        <w:rPr>
-          <w:rFonts w:cs="Times New Roman" w:ascii="Times New Roman" w:hAnsi="Times New Roman"/>
-        </w:rPr>
-        <w:t>Un sistema que maneje dinero sin manual de usuario ni DER actualizado es peligroso porque ante cualquier inconveniente no hay forma de saber lo que esta fallando, estaríamos confiando todo el proyecto en la memoria del primer programador sin posibilidad de que otra persona tome el trabajo.</w:t>
+        <w:t>. Un sistema que maneje dinero sin manual de usuario ni DER actualizado es peligroso porque ante cualquier inconveniente no hay forma de saber lo que esta fallando, estaríamos confiando todo el proyecto en la memoria del primer programador sin posibilidad de que otra persona tome el trabajo.</w:t>
       </w:r>
     </w:p>
     <w:p>
@@ -1178,13 +1163,1030 @@
         <w:rPr>
           <w:rFonts w:cs="Times New Roman" w:ascii="Times New Roman" w:hAnsi="Times New Roman"/>
         </w:rPr>
-        <w:t xml:space="preserve">. </w:t>
-      </w:r>
-      <w:r>
-        <w:rPr>
-          <w:rFonts w:cs="Times New Roman" w:ascii="Times New Roman" w:hAnsi="Times New Roman"/>
-        </w:rPr>
-        <w:t>Se trata de soporte y mantenimiento del sistema, ya que cuando se creo el mismo el código de la alícuota del IVA era correcto, aunque no haya ningún error en el código se debe actualizar por motivos externos. Es por eso que no es una corrección sino mantenimiento para estar al día.</w:t>
+        <w:t>. Se trata de soporte y mantenimiento del sistema, ya que cuando se creo el mismo el código de la alícuota del IVA era correcto, aunque no haya ningún error en el código se debe actualizar por motivos externos. Es por eso que no es una corrección sino mantenimiento para estar al día.</w:t>
+      </w:r>
+    </w:p>
+    <w:p>
+      <w:pPr>
+        <w:pStyle w:val="ListParagraph"/>
+        <w:bidi w:val="0"/>
+        <w:spacing w:lineRule="auto" w:line="276" w:before="0" w:after="160"/>
+        <w:contextualSpacing/>
+        <w:rPr>
+          <w:rFonts w:ascii="Times New Roman" w:hAnsi="Times New Roman" w:cs="Times New Roman"/>
+        </w:rPr>
+      </w:pPr>
+      <w:r>
+        <w:rPr/>
+      </w:r>
+    </w:p>
+    <w:p>
+      <w:pPr>
+        <w:pStyle w:val="ListParagraph"/>
+        <w:bidi w:val="0"/>
+        <w:spacing w:lineRule="auto" w:line="276" w:before="0" w:after="160"/>
+        <w:contextualSpacing/>
+        <w:rPr>
+          <w:sz w:val="24"/>
+          <w:szCs w:val="24"/>
+          <w:u w:val="single"/>
+        </w:rPr>
+      </w:pPr>
+      <w:r>
+        <w:rPr>
+          <w:rFonts w:cs="Times New Roman" w:ascii="Times New Roman" w:hAnsi="Times New Roman"/>
+          <w:sz w:val="24"/>
+          <w:szCs w:val="24"/>
+          <w:u w:val="single"/>
+        </w:rPr>
+        <w:t>Bloque 2</w:t>
+      </w:r>
+      <w:r>
+        <w:rPr>
+          <w:rFonts w:cs="Times New Roman" w:ascii="Times New Roman" w:hAnsi="Times New Roman"/>
+          <w:sz w:val="24"/>
+          <w:szCs w:val="24"/>
+          <w:u w:val="none"/>
+        </w:rPr>
+        <w:t xml:space="preserve">: </w:t>
+      </w:r>
+      <w:r>
+        <w:rPr>
+          <w:rFonts w:cs="Times New Roman" w:ascii="Times New Roman" w:hAnsi="Times New Roman"/>
+          <w:sz w:val="24"/>
+          <w:szCs w:val="24"/>
+          <w:u w:val="single"/>
+        </w:rPr>
+        <w:t>Ingeniería de requerimientos (Funcional vs. No Funcional)</w:t>
+      </w:r>
+    </w:p>
+    <w:p>
+      <w:pPr>
+        <w:pStyle w:val="ListParagraph"/>
+        <w:bidi w:val="0"/>
+        <w:spacing w:lineRule="auto" w:line="276" w:before="0" w:after="160"/>
+        <w:contextualSpacing/>
+        <w:rPr>
+          <w:rFonts w:ascii="Times New Roman" w:hAnsi="Times New Roman" w:cs="Times New Roman"/>
+        </w:rPr>
+      </w:pPr>
+      <w:r>
+        <w:rPr>
+          <w:sz w:val="24"/>
+          <w:szCs w:val="24"/>
+          <w:u w:val="none"/>
+        </w:rPr>
+      </w:r>
+    </w:p>
+    <w:p>
+      <w:pPr>
+        <w:pStyle w:val="ListParagraph"/>
+        <w:numPr>
+          <w:ilvl w:val="0"/>
+          <w:numId w:val="3"/>
+        </w:numPr>
+        <w:bidi w:val="0"/>
+        <w:spacing w:lineRule="auto" w:line="276" w:before="0" w:after="160"/>
+        <w:contextualSpacing/>
+        <w:rPr/>
+      </w:pPr>
+      <w:r>
+        <w:rPr>
+          <w:rFonts w:cs="Times New Roman" w:ascii="Times New Roman" w:hAnsi="Times New Roman"/>
+          <w:sz w:val="22"/>
+          <w:szCs w:val="22"/>
+          <w:u w:val="single"/>
+        </w:rPr>
+        <w:t>Requerimientos Funcionales (RF)</w:t>
+      </w:r>
+      <w:r>
+        <w:rPr>
+          <w:rFonts w:cs="Times New Roman" w:ascii="Times New Roman" w:hAnsi="Times New Roman"/>
+          <w:sz w:val="22"/>
+          <w:szCs w:val="22"/>
+          <w:u w:val="none"/>
+        </w:rPr>
+        <w:t>:</w:t>
+      </w:r>
+      <w:r>
+        <w:rPr>
+          <w:rFonts w:cs="Times New Roman" w:ascii="Times New Roman" w:hAnsi="Times New Roman"/>
+          <w:sz w:val="24"/>
+          <w:szCs w:val="24"/>
+          <w:u w:val="none"/>
+        </w:rPr>
+        <w:t xml:space="preserve"> </w:t>
+      </w:r>
+      <w:r>
+        <w:rPr>
+          <w:rFonts w:cs="Times New Roman" w:ascii="Times New Roman" w:hAnsi="Times New Roman"/>
+        </w:rPr>
+        <w:t xml:space="preserve">los requerimientos funcionales son los que te dicen qué es lo que tiene que hacer el sistema. </w:t>
+      </w:r>
+      <w:r>
+        <w:rPr>
+          <w:rFonts w:cs="Times New Roman" w:ascii="Times New Roman" w:hAnsi="Times New Roman"/>
+        </w:rPr>
+        <w:t>osea</w:t>
+      </w:r>
+      <w:r>
+        <w:rPr>
+          <w:rFonts w:cs="Times New Roman" w:ascii="Times New Roman" w:hAnsi="Times New Roman"/>
+        </w:rPr>
+        <w:t xml:space="preserve">, describen cómo se tiene que comportar el software, qué cálculos tiene que </w:t>
+      </w:r>
+      <w:r>
+        <w:rPr>
+          <w:rFonts w:cs="Times New Roman" w:ascii="Times New Roman" w:hAnsi="Times New Roman"/>
+        </w:rPr>
+        <w:t>hacer</w:t>
+      </w:r>
+      <w:r>
+        <w:rPr>
+          <w:rFonts w:cs="Times New Roman" w:ascii="Times New Roman" w:hAnsi="Times New Roman"/>
+        </w:rPr>
+        <w:t xml:space="preserve">, cómo procesa los datos y qué servicios ofrece cuando el usuario hace algo o pasa algo en el entorno. </w:t>
+      </w:r>
+      <w:r>
+        <w:rPr>
+          <w:rFonts w:cs="Times New Roman" w:ascii="Times New Roman" w:hAnsi="Times New Roman"/>
+        </w:rPr>
+        <w:t xml:space="preserve">Básicamente es una </w:t>
+      </w:r>
+      <w:r>
+        <w:rPr>
+          <w:rFonts w:cs="Times New Roman" w:ascii="Times New Roman" w:hAnsi="Times New Roman"/>
+        </w:rPr>
+        <w:t xml:space="preserve">lista de las tareas que el sistema </w:t>
+      </w:r>
+      <w:r>
+        <w:rPr>
+          <w:rFonts w:cs="Times New Roman" w:ascii="Times New Roman" w:hAnsi="Times New Roman"/>
+        </w:rPr>
+        <w:t xml:space="preserve">tiene que hacer, </w:t>
+      </w:r>
+      <w:r>
+        <w:rPr>
+          <w:rFonts w:cs="Times New Roman" w:ascii="Times New Roman" w:hAnsi="Times New Roman"/>
+        </w:rPr>
+        <w:t>osea, “Lo que hace”.</w:t>
+      </w:r>
+    </w:p>
+    <w:p>
+      <w:pPr>
+        <w:pStyle w:val="ListParagraph"/>
+        <w:bidi w:val="0"/>
+        <w:spacing w:lineRule="auto" w:line="276" w:before="0" w:after="160"/>
+        <w:contextualSpacing/>
+        <w:rPr>
+          <w:rFonts w:ascii="Times New Roman" w:hAnsi="Times New Roman" w:cs="Times New Roman"/>
+        </w:rPr>
+      </w:pPr>
+      <w:r>
+        <w:rPr/>
+      </w:r>
+    </w:p>
+    <w:p>
+      <w:pPr>
+        <w:pStyle w:val="ListParagraph"/>
+        <w:numPr>
+          <w:ilvl w:val="0"/>
+          <w:numId w:val="2"/>
+        </w:numPr>
+        <w:bidi w:val="0"/>
+        <w:spacing w:lineRule="auto" w:line="276" w:before="0" w:after="160"/>
+        <w:contextualSpacing/>
+        <w:rPr/>
+      </w:pPr>
+      <w:r>
+        <w:rPr>
+          <w:rFonts w:cs="Times New Roman" w:ascii="Times New Roman" w:hAnsi="Times New Roman"/>
+          <w:b w:val="false"/>
+          <w:bCs w:val="false"/>
+          <w:u w:val="single"/>
+        </w:rPr>
+        <w:t>Desafio TecnoService</w:t>
+      </w:r>
+      <w:r>
+        <w:rPr>
+          <w:rFonts w:cs="Times New Roman" w:ascii="Times New Roman" w:hAnsi="Times New Roman"/>
+          <w:b w:val="false"/>
+          <w:bCs w:val="false"/>
+          <w:u w:val="none"/>
+        </w:rPr>
+        <w:t xml:space="preserve">: El sistema de TecnoService tiene que tener si o si funciones de facturación </w:t>
+      </w:r>
+      <w:r>
+        <w:rPr>
+          <w:rFonts w:cs="Times New Roman" w:ascii="Times New Roman" w:hAnsi="Times New Roman"/>
+          <w:b w:val="false"/>
+          <w:bCs w:val="false"/>
+          <w:u w:val="none"/>
+        </w:rPr>
+        <w:t xml:space="preserve">que generen comprobantes de pago, ademas el sistema tiene que tener cargado cada producto con su precio para tener un </w:t>
+      </w:r>
+      <w:r>
+        <w:rPr>
+          <w:rFonts w:cs="Times New Roman" w:ascii="Times New Roman" w:hAnsi="Times New Roman"/>
+          <w:b w:val="false"/>
+          <w:bCs w:val="false"/>
+          <w:u w:val="none"/>
+        </w:rPr>
+        <w:t>control de</w:t>
+      </w:r>
+      <w:r>
+        <w:rPr>
+          <w:rFonts w:cs="Times New Roman" w:ascii="Times New Roman" w:hAnsi="Times New Roman"/>
+          <w:b w:val="false"/>
+          <w:bCs w:val="false"/>
+          <w:u w:val="none"/>
+        </w:rPr>
+        <w:t>l</w:t>
+      </w:r>
+      <w:r>
+        <w:rPr>
+          <w:rFonts w:cs="Times New Roman" w:ascii="Times New Roman" w:hAnsi="Times New Roman"/>
+          <w:b w:val="false"/>
+          <w:bCs w:val="false"/>
+          <w:u w:val="none"/>
+        </w:rPr>
+        <w:t xml:space="preserve"> stock </w:t>
+      </w:r>
+      <w:r>
+        <w:rPr>
+          <w:rFonts w:cs="Times New Roman" w:ascii="Times New Roman" w:hAnsi="Times New Roman"/>
+          <w:b w:val="false"/>
+          <w:bCs w:val="false"/>
+          <w:u w:val="none"/>
+        </w:rPr>
+        <w:t>y catalogo disponible y tiene que contar con un registro de cómo entra la plata, el sistema debe permitir asentar si el pago fue en efectivo, transferencia, tarjeta o cuenta corriente, y dejar el estado de la cuenta del cliente actualizado.</w:t>
+      </w:r>
+    </w:p>
+    <w:p>
+      <w:pPr>
+        <w:pStyle w:val="ListParagraph"/>
+        <w:bidi w:val="0"/>
+        <w:spacing w:lineRule="auto" w:line="276" w:before="0" w:after="160"/>
+        <w:contextualSpacing/>
+        <w:rPr>
+          <w:rFonts w:ascii="Times New Roman" w:hAnsi="Times New Roman" w:cs="Times New Roman"/>
+          <w:b w:val="false"/>
+          <w:b w:val="false"/>
+          <w:bCs w:val="false"/>
+          <w:u w:val="none"/>
+        </w:rPr>
+      </w:pPr>
+      <w:r>
+        <w:rPr/>
+      </w:r>
+    </w:p>
+    <w:p>
+      <w:pPr>
+        <w:pStyle w:val="ListParagraph"/>
+        <w:numPr>
+          <w:ilvl w:val="0"/>
+          <w:numId w:val="2"/>
+        </w:numPr>
+        <w:bidi w:val="0"/>
+        <w:spacing w:lineRule="auto" w:line="276" w:before="0" w:after="160"/>
+        <w:contextualSpacing/>
+        <w:rPr/>
+      </w:pPr>
+      <w:r>
+        <w:rPr>
+          <w:rFonts w:cs="Times New Roman" w:ascii="Times New Roman" w:hAnsi="Times New Roman"/>
+          <w:b w:val="false"/>
+          <w:bCs w:val="false"/>
+          <w:sz w:val="22"/>
+          <w:szCs w:val="22"/>
+          <w:u w:val="single"/>
+        </w:rPr>
+        <w:t xml:space="preserve">Requerimientos </w:t>
+      </w:r>
+      <w:r>
+        <w:rPr>
+          <w:rFonts w:cs="Times New Roman" w:ascii="Times New Roman" w:hAnsi="Times New Roman"/>
+          <w:b w:val="false"/>
+          <w:bCs w:val="false"/>
+          <w:sz w:val="22"/>
+          <w:szCs w:val="22"/>
+          <w:u w:val="single"/>
+        </w:rPr>
+        <w:t>No</w:t>
+      </w:r>
+      <w:r>
+        <w:rPr>
+          <w:rFonts w:cs="Times New Roman" w:ascii="Times New Roman" w:hAnsi="Times New Roman"/>
+          <w:b w:val="false"/>
+          <w:bCs w:val="false"/>
+          <w:sz w:val="22"/>
+          <w:szCs w:val="22"/>
+          <w:u w:val="single"/>
+        </w:rPr>
+        <w:t xml:space="preserve"> Funcionales (R</w:t>
+      </w:r>
+      <w:r>
+        <w:rPr>
+          <w:rFonts w:cs="Times New Roman" w:ascii="Times New Roman" w:hAnsi="Times New Roman"/>
+          <w:b w:val="false"/>
+          <w:bCs w:val="false"/>
+          <w:sz w:val="22"/>
+          <w:szCs w:val="22"/>
+          <w:u w:val="single"/>
+        </w:rPr>
+        <w:t>N</w:t>
+      </w:r>
+      <w:r>
+        <w:rPr>
+          <w:rFonts w:cs="Times New Roman" w:ascii="Times New Roman" w:hAnsi="Times New Roman"/>
+          <w:b w:val="false"/>
+          <w:bCs w:val="false"/>
+          <w:sz w:val="22"/>
+          <w:szCs w:val="22"/>
+          <w:u w:val="single"/>
+        </w:rPr>
+        <w:t>F</w:t>
+      </w:r>
+      <w:r>
+        <w:rPr>
+          <w:rFonts w:cs="Times New Roman" w:ascii="Times New Roman" w:hAnsi="Times New Roman"/>
+          <w:b w:val="false"/>
+          <w:bCs w:val="false"/>
+          <w:sz w:val="22"/>
+          <w:szCs w:val="22"/>
+          <w:u w:val="single"/>
+        </w:rPr>
+        <w:t>)</w:t>
+      </w:r>
+      <w:r>
+        <w:rPr>
+          <w:rFonts w:cs="Times New Roman" w:ascii="Times New Roman" w:hAnsi="Times New Roman"/>
+          <w:b w:val="false"/>
+          <w:bCs w:val="false"/>
+          <w:sz w:val="22"/>
+          <w:szCs w:val="22"/>
+          <w:u w:val="none"/>
+        </w:rPr>
+        <w:t xml:space="preserve">: Los requerimientos no funcionales tienen </w:t>
+      </w:r>
+      <w:r>
+        <w:rPr>
+          <w:rFonts w:cs="Times New Roman" w:ascii="Times New Roman" w:hAnsi="Times New Roman"/>
+          <w:b w:val="false"/>
+          <w:bCs w:val="false"/>
+          <w:sz w:val="22"/>
+          <w:szCs w:val="22"/>
+          <w:u w:val="none"/>
+        </w:rPr>
+        <w:t xml:space="preserve">que </w:t>
+      </w:r>
+      <w:r>
+        <w:rPr>
+          <w:rFonts w:cs="Times New Roman" w:ascii="Times New Roman" w:hAnsi="Times New Roman"/>
+          <w:b w:val="false"/>
+          <w:bCs w:val="false"/>
+          <w:sz w:val="22"/>
+          <w:szCs w:val="22"/>
+          <w:u w:val="none"/>
+        </w:rPr>
+        <w:t xml:space="preserve">ver con </w:t>
+      </w:r>
+      <w:r>
+        <w:rPr>
+          <w:rFonts w:cs="Times New Roman" w:ascii="Times New Roman" w:hAnsi="Times New Roman"/>
+          <w:b w:val="false"/>
+          <w:bCs w:val="false"/>
+          <w:sz w:val="22"/>
+          <w:szCs w:val="22"/>
+          <w:u w:val="none"/>
+        </w:rPr>
+        <w:t>la calidad y la experiencia</w:t>
+      </w:r>
+      <w:r>
+        <w:rPr>
+          <w:rFonts w:cs="Times New Roman" w:ascii="Times New Roman" w:hAnsi="Times New Roman"/>
+          <w:b/>
+          <w:bCs/>
+          <w:sz w:val="22"/>
+          <w:szCs w:val="22"/>
+          <w:u w:val="none"/>
+        </w:rPr>
+        <w:t xml:space="preserve"> </w:t>
+      </w:r>
+      <w:r>
+        <w:rPr>
+          <w:rFonts w:cs="Times New Roman" w:ascii="Times New Roman" w:hAnsi="Times New Roman"/>
+          <w:b w:val="false"/>
+          <w:bCs w:val="false"/>
+          <w:sz w:val="22"/>
+          <w:szCs w:val="22"/>
+          <w:u w:val="none"/>
+        </w:rPr>
+        <w:t xml:space="preserve">de cómo funciona </w:t>
+      </w:r>
+      <w:r>
+        <w:rPr>
+          <w:rFonts w:cs="Times New Roman" w:ascii="Times New Roman" w:hAnsi="Times New Roman"/>
+          <w:b w:val="false"/>
+          <w:bCs w:val="false"/>
+          <w:sz w:val="22"/>
+          <w:szCs w:val="22"/>
+          <w:u w:val="none"/>
+        </w:rPr>
+        <w:t xml:space="preserve">el sistema. Es lo que te dice si el sistema es rápido, seguro, si es cómodo de usar o si se cae a cada rato. Seria el “Como es” del sistema. </w:t>
+      </w:r>
+      <w:r>
+        <w:rPr>
+          <w:rFonts w:cs="Times New Roman" w:ascii="Times New Roman" w:hAnsi="Times New Roman"/>
+          <w:b w:val="false"/>
+          <w:bCs w:val="false"/>
+          <w:sz w:val="22"/>
+          <w:szCs w:val="22"/>
+          <w:u w:val="none"/>
+        </w:rPr>
+        <w:t>Miden la eficiencia, seguridad, usabilidad, fiabilidad y mantenibilidad del software.</w:t>
+      </w:r>
+    </w:p>
+    <w:p>
+      <w:pPr>
+        <w:pStyle w:val="ListParagraph"/>
+        <w:numPr>
+          <w:ilvl w:val="0"/>
+          <w:numId w:val="0"/>
+        </w:numPr>
+        <w:bidi w:val="0"/>
+        <w:spacing w:lineRule="auto" w:line="276" w:before="0" w:after="160"/>
+        <w:ind w:left="1440" w:hanging="0"/>
+        <w:contextualSpacing/>
+        <w:rPr>
+          <w:rFonts w:ascii="Times New Roman" w:hAnsi="Times New Roman" w:cs="Times New Roman"/>
+          <w:b w:val="false"/>
+          <w:b w:val="false"/>
+          <w:bCs w:val="false"/>
+          <w:sz w:val="22"/>
+          <w:szCs w:val="22"/>
+          <w:u w:val="none"/>
+        </w:rPr>
+      </w:pPr>
+      <w:r>
+        <w:rPr/>
+      </w:r>
+    </w:p>
+    <w:p>
+      <w:pPr>
+        <w:pStyle w:val="ListParagraph"/>
+        <w:numPr>
+          <w:ilvl w:val="0"/>
+          <w:numId w:val="2"/>
+        </w:numPr>
+        <w:bidi w:val="0"/>
+        <w:spacing w:lineRule="auto" w:line="276" w:before="0" w:after="160"/>
+        <w:contextualSpacing/>
+        <w:rPr/>
+      </w:pPr>
+      <w:r>
+        <w:rPr>
+          <w:rFonts w:cs="Times New Roman" w:ascii="Times New Roman" w:hAnsi="Times New Roman"/>
+          <w:b w:val="false"/>
+          <w:bCs w:val="false"/>
+          <w:sz w:val="22"/>
+          <w:szCs w:val="22"/>
+          <w:u w:val="single"/>
+        </w:rPr>
+        <w:t>Desafio TecnoService</w:t>
+      </w:r>
+      <w:r>
+        <w:rPr>
+          <w:rFonts w:cs="Times New Roman" w:ascii="Times New Roman" w:hAnsi="Times New Roman"/>
+          <w:b w:val="false"/>
+          <w:bCs w:val="false"/>
+          <w:sz w:val="22"/>
+          <w:szCs w:val="22"/>
+          <w:u w:val="none"/>
+        </w:rPr>
+        <w:t xml:space="preserve">: </w:t>
+      </w:r>
+      <w:r>
+        <w:rPr>
+          <w:rFonts w:cs="Times New Roman" w:ascii="Times New Roman" w:hAnsi="Times New Roman"/>
+          <w:b w:val="false"/>
+          <w:bCs w:val="false"/>
+          <w:sz w:val="22"/>
+          <w:szCs w:val="22"/>
+          <w:u w:val="none"/>
+        </w:rPr>
+        <w:t>Si el sistema tiene esos tipos de fallos significa que esta teniendo problemas de eficiencia según los RNF y esto afecta de forma negativa al negocio ya que ralentiza y entorpece todas las operaciones.</w:t>
+      </w:r>
+    </w:p>
+    <w:p>
+      <w:pPr>
+        <w:pStyle w:val="ListParagraph"/>
+        <w:numPr>
+          <w:ilvl w:val="0"/>
+          <w:numId w:val="0"/>
+        </w:numPr>
+        <w:bidi w:val="0"/>
+        <w:spacing w:lineRule="auto" w:line="276" w:before="0" w:after="160"/>
+        <w:ind w:left="1440" w:hanging="0"/>
+        <w:contextualSpacing/>
+        <w:rPr>
+          <w:rFonts w:ascii="Times New Roman" w:hAnsi="Times New Roman" w:cs="Times New Roman"/>
+          <w:b w:val="false"/>
+          <w:b w:val="false"/>
+          <w:bCs w:val="false"/>
+          <w:sz w:val="22"/>
+          <w:szCs w:val="22"/>
+          <w:u w:val="none"/>
+        </w:rPr>
+      </w:pPr>
+      <w:r>
+        <w:rPr/>
+      </w:r>
+    </w:p>
+    <w:p>
+      <w:pPr>
+        <w:pStyle w:val="ListParagraph"/>
+        <w:numPr>
+          <w:ilvl w:val="0"/>
+          <w:numId w:val="2"/>
+        </w:numPr>
+        <w:bidi w:val="0"/>
+        <w:spacing w:lineRule="auto" w:line="276" w:before="0" w:after="160"/>
+        <w:contextualSpacing/>
+        <w:rPr>
+          <w:b w:val="false"/>
+          <w:b w:val="false"/>
+          <w:bCs w:val="false"/>
+        </w:rPr>
+      </w:pPr>
+      <w:r>
+        <w:rPr>
+          <w:rFonts w:cs="Times New Roman" w:ascii="Times New Roman" w:hAnsi="Times New Roman"/>
+          <w:b w:val="false"/>
+          <w:bCs w:val="false"/>
+          <w:sz w:val="22"/>
+          <w:szCs w:val="22"/>
+          <w:u w:val="single"/>
+        </w:rPr>
+        <w:t>Documento de alcance</w:t>
+      </w:r>
+      <w:r>
+        <w:rPr>
+          <w:rFonts w:cs="Times New Roman" w:ascii="Times New Roman" w:hAnsi="Times New Roman"/>
+          <w:b w:val="false"/>
+          <w:bCs w:val="false"/>
+          <w:sz w:val="22"/>
+          <w:szCs w:val="22"/>
+          <w:u w:val="none"/>
+        </w:rPr>
+        <w:t>: El D</w:t>
+      </w:r>
+      <w:r>
+        <w:rPr>
+          <w:rFonts w:cs="Times New Roman" w:ascii="Times New Roman" w:hAnsi="Times New Roman"/>
+          <w:b w:val="false"/>
+          <w:bCs w:val="false"/>
+          <w:sz w:val="22"/>
+          <w:szCs w:val="22"/>
+          <w:u w:val="none"/>
+        </w:rPr>
+        <w:t xml:space="preserve">ocumento de Alcance </w:t>
+      </w:r>
+      <w:r>
+        <w:rPr>
+          <w:rFonts w:cs="Times New Roman" w:ascii="Times New Roman" w:hAnsi="Times New Roman"/>
+          <w:b w:val="false"/>
+          <w:bCs w:val="false"/>
+          <w:sz w:val="22"/>
+          <w:szCs w:val="22"/>
+          <w:u w:val="none"/>
+        </w:rPr>
+        <w:t xml:space="preserve">es una declaración formal que detalla el objetivo del proyecto, los entregables esperados, las tareas principales, los costos estimados y el cronograma previsto del proyecto, establece una visión compartida del desarrollador y del cliente de lo que va a ser el sistema. </w:t>
+      </w:r>
+      <w:r>
+        <w:rPr>
+          <w:rFonts w:cs="Times New Roman" w:ascii="Times New Roman" w:hAnsi="Times New Roman"/>
+          <w:b w:val="false"/>
+          <w:bCs w:val="false"/>
+          <w:sz w:val="22"/>
+          <w:szCs w:val="22"/>
+          <w:u w:val="none"/>
+        </w:rPr>
+        <w:t>Se lo considera un contrato porque funciona como un acuerdo de como van a ser las cosas.</w:t>
+      </w:r>
+    </w:p>
+    <w:p>
+      <w:pPr>
+        <w:pStyle w:val="ListParagraph"/>
+        <w:numPr>
+          <w:ilvl w:val="0"/>
+          <w:numId w:val="0"/>
+        </w:numPr>
+        <w:bidi w:val="0"/>
+        <w:spacing w:lineRule="auto" w:line="276" w:before="0" w:after="160"/>
+        <w:ind w:left="1440" w:hanging="0"/>
+        <w:contextualSpacing/>
+        <w:rPr>
+          <w:rFonts w:ascii="Times New Roman" w:hAnsi="Times New Roman" w:cs="Times New Roman"/>
+          <w:sz w:val="22"/>
+          <w:szCs w:val="22"/>
+          <w:u w:val="none"/>
+        </w:rPr>
+      </w:pPr>
+      <w:r>
+        <w:rPr>
+          <w:b w:val="false"/>
+          <w:bCs w:val="false"/>
+        </w:rPr>
+      </w:r>
+    </w:p>
+    <w:p>
+      <w:pPr>
+        <w:pStyle w:val="ListParagraph"/>
+        <w:numPr>
+          <w:ilvl w:val="0"/>
+          <w:numId w:val="2"/>
+        </w:numPr>
+        <w:bidi w:val="0"/>
+        <w:spacing w:lineRule="auto" w:line="276" w:before="0" w:after="160"/>
+        <w:contextualSpacing/>
+        <w:rPr>
+          <w:b w:val="false"/>
+          <w:b w:val="false"/>
+          <w:bCs w:val="false"/>
+        </w:rPr>
+      </w:pPr>
+      <w:r>
+        <w:rPr>
+          <w:rFonts w:cs="Times New Roman" w:ascii="Times New Roman" w:hAnsi="Times New Roman"/>
+          <w:b w:val="false"/>
+          <w:bCs w:val="false"/>
+          <w:sz w:val="22"/>
+          <w:szCs w:val="22"/>
+          <w:u w:val="single"/>
+        </w:rPr>
+        <w:t>Desafio TecnoService</w:t>
+      </w:r>
+      <w:r>
+        <w:rPr>
+          <w:rFonts w:cs="Times New Roman" w:ascii="Times New Roman" w:hAnsi="Times New Roman"/>
+          <w:b w:val="false"/>
+          <w:bCs w:val="false"/>
+          <w:sz w:val="22"/>
+          <w:szCs w:val="22"/>
+          <w:u w:val="none"/>
+        </w:rPr>
+        <w:t xml:space="preserve">: </w:t>
+      </w:r>
+      <w:r>
+        <w:rPr>
+          <w:rFonts w:cs="Times New Roman" w:ascii="Times New Roman" w:hAnsi="Times New Roman"/>
+          <w:b w:val="false"/>
+          <w:bCs w:val="false"/>
+          <w:sz w:val="22"/>
+          <w:szCs w:val="22"/>
+          <w:u w:val="none"/>
+        </w:rPr>
+        <w:t>Si el cliente empieza a pedir nuevos agregados a mitad de proyecto puedo defenderme utilizando el documento de alcance y marcandole que eso no estaba establecido en los requerimientos, si el cliente quisiera agregar nuevas cosas tendríamos que realizar una revisión del documento.</w:t>
+      </w:r>
+    </w:p>
+    <w:p>
+      <w:pPr>
+        <w:pStyle w:val="ListParagraph"/>
+        <w:bidi w:val="0"/>
+        <w:spacing w:lineRule="auto" w:line="276" w:before="0" w:after="160"/>
+        <w:contextualSpacing/>
+        <w:rPr>
+          <w:rFonts w:ascii="Times New Roman" w:hAnsi="Times New Roman" w:cs="Times New Roman"/>
+          <w:sz w:val="22"/>
+          <w:szCs w:val="22"/>
+          <w:u w:val="none"/>
+        </w:rPr>
+      </w:pPr>
+      <w:r>
+        <w:rPr>
+          <w:b w:val="false"/>
+          <w:bCs w:val="false"/>
+        </w:rPr>
+      </w:r>
+    </w:p>
+    <w:p>
+      <w:pPr>
+        <w:pStyle w:val="ListParagraph"/>
+        <w:bidi w:val="0"/>
+        <w:spacing w:lineRule="auto" w:line="276" w:before="0" w:after="160"/>
+        <w:contextualSpacing/>
+        <w:rPr>
+          <w:b w:val="false"/>
+          <w:b w:val="false"/>
+          <w:bCs w:val="false"/>
+          <w:sz w:val="24"/>
+          <w:szCs w:val="24"/>
+        </w:rPr>
+      </w:pPr>
+      <w:r>
+        <w:rPr>
+          <w:rFonts w:cs="Times New Roman" w:ascii="Times New Roman" w:hAnsi="Times New Roman"/>
+          <w:b w:val="false"/>
+          <w:bCs w:val="false"/>
+          <w:sz w:val="24"/>
+          <w:szCs w:val="24"/>
+          <w:u w:val="single"/>
+        </w:rPr>
+        <w:t>Bloque 3</w:t>
+      </w:r>
+      <w:r>
+        <w:rPr>
+          <w:rFonts w:cs="Times New Roman" w:ascii="Times New Roman" w:hAnsi="Times New Roman"/>
+          <w:b w:val="false"/>
+          <w:bCs w:val="false"/>
+          <w:sz w:val="24"/>
+          <w:szCs w:val="24"/>
+          <w:u w:val="none"/>
+        </w:rPr>
+        <w:t xml:space="preserve">: </w:t>
+      </w:r>
+      <w:r>
+        <w:rPr>
+          <w:rFonts w:cs="Times New Roman" w:ascii="Times New Roman" w:hAnsi="Times New Roman"/>
+          <w:b w:val="false"/>
+          <w:bCs w:val="false"/>
+          <w:sz w:val="24"/>
+          <w:szCs w:val="24"/>
+          <w:u w:val="single"/>
+        </w:rPr>
+        <w:t>Razonamiento Critico (El ojo del Analista)</w:t>
+      </w:r>
+    </w:p>
+    <w:p>
+      <w:pPr>
+        <w:pStyle w:val="ListParagraph"/>
+        <w:bidi w:val="0"/>
+        <w:spacing w:lineRule="auto" w:line="276" w:before="0" w:after="160"/>
+        <w:contextualSpacing/>
+        <w:rPr>
+          <w:rFonts w:ascii="Times New Roman" w:hAnsi="Times New Roman" w:cs="Times New Roman"/>
+          <w:u w:val="single"/>
+        </w:rPr>
+      </w:pPr>
+      <w:r>
+        <w:rPr>
+          <w:b w:val="false"/>
+          <w:bCs w:val="false"/>
+          <w:sz w:val="24"/>
+          <w:szCs w:val="24"/>
+        </w:rPr>
+      </w:r>
+    </w:p>
+    <w:p>
+      <w:pPr>
+        <w:pStyle w:val="ListParagraph"/>
+        <w:numPr>
+          <w:ilvl w:val="0"/>
+          <w:numId w:val="4"/>
+        </w:numPr>
+        <w:bidi w:val="0"/>
+        <w:spacing w:lineRule="auto" w:line="276" w:before="0" w:after="160"/>
+        <w:contextualSpacing/>
+        <w:rPr>
+          <w:b w:val="false"/>
+          <w:b w:val="false"/>
+          <w:bCs w:val="false"/>
+          <w:sz w:val="22"/>
+          <w:szCs w:val="22"/>
+          <w:u w:val="none"/>
+        </w:rPr>
+      </w:pPr>
+      <w:r>
+        <w:rPr>
+          <w:rFonts w:cs="Times New Roman" w:ascii="Times New Roman" w:hAnsi="Times New Roman"/>
+          <w:b w:val="false"/>
+          <w:bCs w:val="false"/>
+          <w:sz w:val="22"/>
+          <w:szCs w:val="22"/>
+          <w:u w:val="none"/>
+        </w:rPr>
+        <w:t>Situación: Si el cliente no sabe cuanto quiere gastar ni en cuanto tiempo la necesita el proyecto debe ser frenado en la primera fase de Kendall &amp; Kendall ya que en esta es en la que identificamos esas variables.</w:t>
+      </w:r>
+    </w:p>
+    <w:p>
+      <w:pPr>
+        <w:pStyle w:val="ListParagraph"/>
+        <w:numPr>
+          <w:ilvl w:val="0"/>
+          <w:numId w:val="0"/>
+        </w:numPr>
+        <w:bidi w:val="0"/>
+        <w:spacing w:lineRule="auto" w:line="276" w:before="0" w:after="160"/>
+        <w:ind w:left="720" w:hanging="0"/>
+        <w:contextualSpacing/>
+        <w:rPr>
+          <w:rFonts w:ascii="Times New Roman" w:hAnsi="Times New Roman" w:cs="Times New Roman"/>
+        </w:rPr>
+      </w:pPr>
+      <w:r>
+        <w:rPr>
+          <w:b w:val="false"/>
+          <w:bCs w:val="false"/>
+          <w:sz w:val="22"/>
+          <w:szCs w:val="22"/>
+          <w:u w:val="none"/>
+        </w:rPr>
+      </w:r>
+    </w:p>
+    <w:p>
+      <w:pPr>
+        <w:pStyle w:val="ListParagraph"/>
+        <w:numPr>
+          <w:ilvl w:val="0"/>
+          <w:numId w:val="4"/>
+        </w:numPr>
+        <w:bidi w:val="0"/>
+        <w:spacing w:lineRule="auto" w:line="276" w:before="0" w:after="160"/>
+        <w:contextualSpacing/>
+        <w:rPr>
+          <w:b w:val="false"/>
+          <w:b w:val="false"/>
+          <w:bCs w:val="false"/>
+          <w:sz w:val="22"/>
+          <w:szCs w:val="22"/>
+          <w:u w:val="none"/>
+        </w:rPr>
+      </w:pPr>
+      <w:r>
+        <w:rPr>
+          <w:rFonts w:cs="Times New Roman" w:ascii="Times New Roman" w:hAnsi="Times New Roman"/>
+          <w:b w:val="false"/>
+          <w:bCs w:val="false"/>
+          <w:sz w:val="22"/>
+          <w:szCs w:val="22"/>
+          <w:u w:val="none"/>
+        </w:rPr>
+        <w:t>Importancia de la Documentación: Es fundamental documentar todo desde el principio en vez de confiar en la memoria así, de este modo, si encontramos cualquier error o inconsistencia ya tenemos una guiá de donde podría estar, ademas permitimos la escalabilidad del proyecto y que otro lo pueda leer e interpretar.</w:t>
+      </w:r>
+    </w:p>
+    <w:p>
+      <w:pPr>
+        <w:pStyle w:val="ListParagraph"/>
+        <w:bidi w:val="0"/>
+        <w:spacing w:lineRule="auto" w:line="276" w:before="0" w:after="160"/>
+        <w:ind w:hanging="0"/>
+        <w:contextualSpacing/>
+        <w:rPr>
+          <w:rFonts w:ascii="Times New Roman" w:hAnsi="Times New Roman" w:cs="Times New Roman"/>
+        </w:rPr>
+      </w:pPr>
+      <w:r>
+        <w:rPr>
+          <w:b w:val="false"/>
+          <w:bCs w:val="false"/>
+          <w:sz w:val="22"/>
+          <w:szCs w:val="22"/>
+          <w:u w:val="none"/>
+        </w:rPr>
+      </w:r>
+    </w:p>
+    <w:p>
+      <w:pPr>
+        <w:pStyle w:val="ListParagraph"/>
+        <w:numPr>
+          <w:ilvl w:val="0"/>
+          <w:numId w:val="4"/>
+        </w:numPr>
+        <w:bidi w:val="0"/>
+        <w:spacing w:lineRule="auto" w:line="276" w:before="0" w:after="160"/>
+        <w:contextualSpacing/>
+        <w:rPr>
+          <w:b w:val="false"/>
+          <w:b w:val="false"/>
+          <w:bCs w:val="false"/>
+          <w:sz w:val="22"/>
+          <w:szCs w:val="22"/>
+          <w:u w:val="none"/>
+        </w:rPr>
+      </w:pPr>
+      <w:r>
+        <w:rPr>
+          <w:rFonts w:cs="Times New Roman" w:ascii="Times New Roman" w:hAnsi="Times New Roman"/>
+          <w:b w:val="false"/>
+          <w:bCs w:val="false"/>
+          <w:sz w:val="22"/>
+          <w:szCs w:val="22"/>
+          <w:u w:val="none"/>
+        </w:rPr>
+        <w:t>Simulación de Error: Si el sistema permite cargar formateos con stock negativo el equipo fallo en la fase 6 del Kendall &amp; Kendall porque esta es la que se encarga de realizar las pruebas de mantenimiento y pruebas para la corrección de errores como estos.</w:t>
+      </w:r>
+    </w:p>
+    <w:p>
+      <w:pPr>
+        <w:pStyle w:val="ListParagraph"/>
+        <w:numPr>
+          <w:ilvl w:val="0"/>
+          <w:numId w:val="0"/>
+        </w:numPr>
+        <w:bidi w:val="0"/>
+        <w:spacing w:lineRule="auto" w:line="276" w:before="0" w:after="160"/>
+        <w:ind w:left="1440" w:hanging="0"/>
+        <w:contextualSpacing/>
+        <w:rPr>
+          <w:rFonts w:ascii="Times New Roman" w:hAnsi="Times New Roman" w:cs="Times New Roman"/>
+        </w:rPr>
+      </w:pPr>
+      <w:r>
+        <w:rPr>
+          <w:b w:val="false"/>
+          <w:bCs w:val="false"/>
+          <w:sz w:val="22"/>
+          <w:szCs w:val="22"/>
+          <w:u w:val="none"/>
+        </w:rPr>
+      </w:r>
+    </w:p>
+    <w:p>
+      <w:pPr>
+        <w:pStyle w:val="ListParagraph"/>
+        <w:numPr>
+          <w:ilvl w:val="0"/>
+          <w:numId w:val="4"/>
+        </w:numPr>
+        <w:bidi w:val="0"/>
+        <w:spacing w:lineRule="auto" w:line="276" w:before="0" w:after="160"/>
+        <w:contextualSpacing/>
+        <w:rPr>
+          <w:b w:val="false"/>
+          <w:b w:val="false"/>
+          <w:bCs w:val="false"/>
+          <w:sz w:val="22"/>
+          <w:szCs w:val="22"/>
+          <w:u w:val="none"/>
+        </w:rPr>
+      </w:pPr>
+      <w:r>
+        <w:rPr>
+          <w:rFonts w:cs="Times New Roman" w:ascii="Times New Roman" w:hAnsi="Times New Roman"/>
+          <w:b w:val="false"/>
+          <w:bCs w:val="false"/>
+          <w:sz w:val="22"/>
+          <w:szCs w:val="22"/>
+          <w:u w:val="none"/>
+        </w:rPr>
+        <w:t>Seguridad: Debo definir los permisos de acceso en la fase 4, cuando estoy diseñando la lógica del sistema y sus jerarquías.</w:t>
+      </w:r>
+    </w:p>
+    <w:p>
+      <w:pPr>
+        <w:pStyle w:val="ListParagraph"/>
+        <w:numPr>
+          <w:ilvl w:val="0"/>
+          <w:numId w:val="0"/>
+        </w:numPr>
+        <w:bidi w:val="0"/>
+        <w:spacing w:lineRule="auto" w:line="276" w:before="0" w:after="160"/>
+        <w:ind w:left="1440" w:hanging="0"/>
+        <w:contextualSpacing/>
+        <w:rPr>
+          <w:rFonts w:ascii="Times New Roman" w:hAnsi="Times New Roman" w:cs="Times New Roman"/>
+        </w:rPr>
+      </w:pPr>
+      <w:r>
+        <w:rPr>
+          <w:b w:val="false"/>
+          <w:bCs w:val="false"/>
+          <w:sz w:val="22"/>
+          <w:szCs w:val="22"/>
+          <w:u w:val="none"/>
+        </w:rPr>
+      </w:r>
+    </w:p>
+    <w:p>
+      <w:pPr>
+        <w:pStyle w:val="ListParagraph"/>
+        <w:numPr>
+          <w:ilvl w:val="0"/>
+          <w:numId w:val="4"/>
+        </w:numPr>
+        <w:bidi w:val="0"/>
+        <w:spacing w:lineRule="auto" w:line="276" w:before="0" w:after="160"/>
+        <w:contextualSpacing/>
+        <w:rPr>
+          <w:b w:val="false"/>
+          <w:b w:val="false"/>
+          <w:bCs w:val="false"/>
+          <w:sz w:val="22"/>
+          <w:szCs w:val="22"/>
+          <w:u w:val="none"/>
+        </w:rPr>
+      </w:pPr>
+      <w:r>
+        <w:rPr>
+          <w:rFonts w:cs="Times New Roman" w:ascii="Times New Roman" w:hAnsi="Times New Roman"/>
+          <w:b w:val="false"/>
+          <w:bCs w:val="false"/>
+          <w:sz w:val="22"/>
+          <w:szCs w:val="22"/>
+          <w:u w:val="none"/>
+        </w:rPr>
+        <w:t>El “Contrato” de Salida: No se puede decir que la fase 4 fue exitosa ya que el DER es una herramienta fundamental para la seguridad del sistema y no tenerla es una falla grave de seguridad.</w:t>
       </w:r>
     </w:p>
     <w:sectPr>
@@ -1214,6 +2216,7 @@
       </w:pPr>
       <w:rPr>
         <w:rFonts w:ascii="Symbol" w:hAnsi="Symbol" w:cs="Symbol" w:hint="default"/>
+        <w:rFonts w:cs="Symbol"/>
       </w:rPr>
     </w:lvl>
     <w:lvl w:ilvl="1">
@@ -1239,6 +2242,7 @@
       </w:pPr>
       <w:rPr>
         <w:rFonts w:ascii="Wingdings" w:hAnsi="Wingdings" w:cs="Wingdings" w:hint="default"/>
+        <w:rFonts w:cs="Wingdings"/>
       </w:rPr>
     </w:lvl>
     <w:lvl w:ilvl="3">
@@ -1251,6 +2255,7 @@
       </w:pPr>
       <w:rPr>
         <w:rFonts w:ascii="Symbol" w:hAnsi="Symbol" w:cs="Symbol" w:hint="default"/>
+        <w:rFonts w:cs="Symbol"/>
       </w:rPr>
     </w:lvl>
     <w:lvl w:ilvl="4">
@@ -1276,6 +2281,7 @@
       </w:pPr>
       <w:rPr>
         <w:rFonts w:ascii="Wingdings" w:hAnsi="Wingdings" w:cs="Wingdings" w:hint="default"/>
+        <w:rFonts w:cs="Wingdings"/>
       </w:rPr>
     </w:lvl>
     <w:lvl w:ilvl="6">
@@ -1288,6 +2294,7 @@
       </w:pPr>
       <w:rPr>
         <w:rFonts w:ascii="Symbol" w:hAnsi="Symbol" w:cs="Symbol" w:hint="default"/>
+        <w:rFonts w:cs="Symbol"/>
       </w:rPr>
     </w:lvl>
     <w:lvl w:ilvl="7">
@@ -1313,10 +2320,449 @@
       </w:pPr>
       <w:rPr>
         <w:rFonts w:ascii="Wingdings" w:hAnsi="Wingdings" w:cs="Wingdings" w:hint="default"/>
+        <w:rFonts w:cs="Wingdings"/>
       </w:rPr>
     </w:lvl>
   </w:abstractNum>
   <w:abstractNum w:abstractNumId="2">
+    <w:lvl w:ilvl="0">
+      <w:start w:val="1"/>
+      <w:numFmt w:val="bullet"/>
+      <w:lvlText w:val=""/>
+      <w:lvlJc w:val="left"/>
+      <w:pPr>
+        <w:tabs>
+          <w:tab w:val="num" w:pos="720"/>
+        </w:tabs>
+        <w:ind w:left="720" w:hanging="360"/>
+      </w:pPr>
+      <w:rPr>
+        <w:rFonts w:ascii="Symbol" w:hAnsi="Symbol" w:cs="Symbol" w:hint="default"/>
+        <w:rFonts w:cs="OpenSymbol"/>
+      </w:rPr>
+    </w:lvl>
+    <w:lvl w:ilvl="1">
+      <w:start w:val="1"/>
+      <w:numFmt w:val="bullet"/>
+      <w:lvlText w:val="◦"/>
+      <w:lvlJc w:val="left"/>
+      <w:pPr>
+        <w:tabs>
+          <w:tab w:val="num" w:pos="1080"/>
+        </w:tabs>
+        <w:ind w:left="1080" w:hanging="360"/>
+      </w:pPr>
+      <w:rPr>
+        <w:rFonts w:ascii="OpenSymbol" w:hAnsi="OpenSymbol" w:cs="OpenSymbol" w:hint="default"/>
+        <w:rFonts w:cs="OpenSymbol"/>
+      </w:rPr>
+    </w:lvl>
+    <w:lvl w:ilvl="2">
+      <w:start w:val="1"/>
+      <w:numFmt w:val="bullet"/>
+      <w:lvlText w:val="▪"/>
+      <w:lvlJc w:val="left"/>
+      <w:pPr>
+        <w:tabs>
+          <w:tab w:val="num" w:pos="1440"/>
+        </w:tabs>
+        <w:ind w:left="1440" w:hanging="360"/>
+      </w:pPr>
+      <w:rPr>
+        <w:rFonts w:ascii="OpenSymbol" w:hAnsi="OpenSymbol" w:cs="OpenSymbol" w:hint="default"/>
+        <w:rFonts w:cs="OpenSymbol"/>
+      </w:rPr>
+    </w:lvl>
+    <w:lvl w:ilvl="3">
+      <w:start w:val="1"/>
+      <w:numFmt w:val="bullet"/>
+      <w:lvlText w:val=""/>
+      <w:lvlJc w:val="left"/>
+      <w:pPr>
+        <w:tabs>
+          <w:tab w:val="num" w:pos="1800"/>
+        </w:tabs>
+        <w:ind w:left="1800" w:hanging="360"/>
+      </w:pPr>
+      <w:rPr>
+        <w:rFonts w:ascii="Symbol" w:hAnsi="Symbol" w:cs="Symbol" w:hint="default"/>
+        <w:rFonts w:cs="OpenSymbol"/>
+      </w:rPr>
+    </w:lvl>
+    <w:lvl w:ilvl="4">
+      <w:start w:val="1"/>
+      <w:numFmt w:val="bullet"/>
+      <w:lvlText w:val="◦"/>
+      <w:lvlJc w:val="left"/>
+      <w:pPr>
+        <w:tabs>
+          <w:tab w:val="num" w:pos="2160"/>
+        </w:tabs>
+        <w:ind w:left="2160" w:hanging="360"/>
+      </w:pPr>
+      <w:rPr>
+        <w:rFonts w:ascii="OpenSymbol" w:hAnsi="OpenSymbol" w:cs="OpenSymbol" w:hint="default"/>
+        <w:rFonts w:cs="OpenSymbol"/>
+      </w:rPr>
+    </w:lvl>
+    <w:lvl w:ilvl="5">
+      <w:start w:val="1"/>
+      <w:numFmt w:val="bullet"/>
+      <w:lvlText w:val="▪"/>
+      <w:lvlJc w:val="left"/>
+      <w:pPr>
+        <w:tabs>
+          <w:tab w:val="num" w:pos="2520"/>
+        </w:tabs>
+        <w:ind w:left="2520" w:hanging="360"/>
+      </w:pPr>
+      <w:rPr>
+        <w:rFonts w:ascii="OpenSymbol" w:hAnsi="OpenSymbol" w:cs="OpenSymbol" w:hint="default"/>
+        <w:rFonts w:cs="OpenSymbol"/>
+      </w:rPr>
+    </w:lvl>
+    <w:lvl w:ilvl="6">
+      <w:start w:val="1"/>
+      <w:numFmt w:val="bullet"/>
+      <w:lvlText w:val=""/>
+      <w:lvlJc w:val="left"/>
+      <w:pPr>
+        <w:tabs>
+          <w:tab w:val="num" w:pos="2880"/>
+        </w:tabs>
+        <w:ind w:left="2880" w:hanging="360"/>
+      </w:pPr>
+      <w:rPr>
+        <w:rFonts w:ascii="Symbol" w:hAnsi="Symbol" w:cs="Symbol" w:hint="default"/>
+        <w:rFonts w:cs="OpenSymbol"/>
+      </w:rPr>
+    </w:lvl>
+    <w:lvl w:ilvl="7">
+      <w:start w:val="1"/>
+      <w:numFmt w:val="bullet"/>
+      <w:lvlText w:val="◦"/>
+      <w:lvlJc w:val="left"/>
+      <w:pPr>
+        <w:tabs>
+          <w:tab w:val="num" w:pos="3240"/>
+        </w:tabs>
+        <w:ind w:left="3240" w:hanging="360"/>
+      </w:pPr>
+      <w:rPr>
+        <w:rFonts w:ascii="OpenSymbol" w:hAnsi="OpenSymbol" w:cs="OpenSymbol" w:hint="default"/>
+        <w:rFonts w:cs="OpenSymbol"/>
+      </w:rPr>
+    </w:lvl>
+    <w:lvl w:ilvl="8">
+      <w:start w:val="1"/>
+      <w:numFmt w:val="bullet"/>
+      <w:lvlText w:val="▪"/>
+      <w:lvlJc w:val="left"/>
+      <w:pPr>
+        <w:tabs>
+          <w:tab w:val="num" w:pos="3600"/>
+        </w:tabs>
+        <w:ind w:left="3600" w:hanging="360"/>
+      </w:pPr>
+      <w:rPr>
+        <w:rFonts w:ascii="OpenSymbol" w:hAnsi="OpenSymbol" w:cs="OpenSymbol" w:hint="default"/>
+        <w:rFonts w:cs="OpenSymbol"/>
+      </w:rPr>
+    </w:lvl>
+  </w:abstractNum>
+  <w:abstractNum w:abstractNumId="3">
+    <w:lvl w:ilvl="0">
+      <w:start w:val="1"/>
+      <w:numFmt w:val="bullet"/>
+      <w:lvlText w:val=""/>
+      <w:lvlJc w:val="left"/>
+      <w:pPr>
+        <w:tabs>
+          <w:tab w:val="num" w:pos="720"/>
+        </w:tabs>
+        <w:ind w:left="720" w:hanging="360"/>
+      </w:pPr>
+      <w:rPr>
+        <w:rFonts w:ascii="Symbol" w:hAnsi="Symbol" w:cs="Symbol" w:hint="default"/>
+        <w:rFonts w:cs="OpenSymbol"/>
+      </w:rPr>
+    </w:lvl>
+    <w:lvl w:ilvl="1">
+      <w:start w:val="1"/>
+      <w:numFmt w:val="bullet"/>
+      <w:lvlText w:val="◦"/>
+      <w:lvlJc w:val="left"/>
+      <w:pPr>
+        <w:tabs>
+          <w:tab w:val="num" w:pos="1080"/>
+        </w:tabs>
+        <w:ind w:left="1080" w:hanging="360"/>
+      </w:pPr>
+      <w:rPr>
+        <w:rFonts w:ascii="OpenSymbol" w:hAnsi="OpenSymbol" w:cs="OpenSymbol" w:hint="default"/>
+        <w:rFonts w:cs="OpenSymbol"/>
+      </w:rPr>
+    </w:lvl>
+    <w:lvl w:ilvl="2">
+      <w:start w:val="1"/>
+      <w:numFmt w:val="bullet"/>
+      <w:lvlText w:val="▪"/>
+      <w:lvlJc w:val="left"/>
+      <w:pPr>
+        <w:tabs>
+          <w:tab w:val="num" w:pos="1440"/>
+        </w:tabs>
+        <w:ind w:left="1440" w:hanging="360"/>
+      </w:pPr>
+      <w:rPr>
+        <w:rFonts w:ascii="OpenSymbol" w:hAnsi="OpenSymbol" w:cs="OpenSymbol" w:hint="default"/>
+        <w:rFonts w:cs="OpenSymbol"/>
+      </w:rPr>
+    </w:lvl>
+    <w:lvl w:ilvl="3">
+      <w:start w:val="1"/>
+      <w:numFmt w:val="bullet"/>
+      <w:lvlText w:val=""/>
+      <w:lvlJc w:val="left"/>
+      <w:pPr>
+        <w:tabs>
+          <w:tab w:val="num" w:pos="1800"/>
+        </w:tabs>
+        <w:ind w:left="1800" w:hanging="360"/>
+      </w:pPr>
+      <w:rPr>
+        <w:rFonts w:ascii="Symbol" w:hAnsi="Symbol" w:cs="Symbol" w:hint="default"/>
+        <w:rFonts w:cs="OpenSymbol"/>
+      </w:rPr>
+    </w:lvl>
+    <w:lvl w:ilvl="4">
+      <w:start w:val="1"/>
+      <w:numFmt w:val="bullet"/>
+      <w:lvlText w:val="◦"/>
+      <w:lvlJc w:val="left"/>
+      <w:pPr>
+        <w:tabs>
+          <w:tab w:val="num" w:pos="2160"/>
+        </w:tabs>
+        <w:ind w:left="2160" w:hanging="360"/>
+      </w:pPr>
+      <w:rPr>
+        <w:rFonts w:ascii="OpenSymbol" w:hAnsi="OpenSymbol" w:cs="OpenSymbol" w:hint="default"/>
+        <w:rFonts w:cs="OpenSymbol"/>
+      </w:rPr>
+    </w:lvl>
+    <w:lvl w:ilvl="5">
+      <w:start w:val="1"/>
+      <w:numFmt w:val="bullet"/>
+      <w:lvlText w:val="▪"/>
+      <w:lvlJc w:val="left"/>
+      <w:pPr>
+        <w:tabs>
+          <w:tab w:val="num" w:pos="2520"/>
+        </w:tabs>
+        <w:ind w:left="2520" w:hanging="360"/>
+      </w:pPr>
+      <w:rPr>
+        <w:rFonts w:ascii="OpenSymbol" w:hAnsi="OpenSymbol" w:cs="OpenSymbol" w:hint="default"/>
+        <w:rFonts w:cs="OpenSymbol"/>
+      </w:rPr>
+    </w:lvl>
+    <w:lvl w:ilvl="6">
+      <w:start w:val="1"/>
+      <w:numFmt w:val="bullet"/>
+      <w:lvlText w:val=""/>
+      <w:lvlJc w:val="left"/>
+      <w:pPr>
+        <w:tabs>
+          <w:tab w:val="num" w:pos="2880"/>
+        </w:tabs>
+        <w:ind w:left="2880" w:hanging="360"/>
+      </w:pPr>
+      <w:rPr>
+        <w:rFonts w:ascii="Symbol" w:hAnsi="Symbol" w:cs="Symbol" w:hint="default"/>
+        <w:rFonts w:cs="OpenSymbol"/>
+      </w:rPr>
+    </w:lvl>
+    <w:lvl w:ilvl="7">
+      <w:start w:val="1"/>
+      <w:numFmt w:val="bullet"/>
+      <w:lvlText w:val="◦"/>
+      <w:lvlJc w:val="left"/>
+      <w:pPr>
+        <w:tabs>
+          <w:tab w:val="num" w:pos="3240"/>
+        </w:tabs>
+        <w:ind w:left="3240" w:hanging="360"/>
+      </w:pPr>
+      <w:rPr>
+        <w:rFonts w:ascii="OpenSymbol" w:hAnsi="OpenSymbol" w:cs="OpenSymbol" w:hint="default"/>
+        <w:rFonts w:cs="OpenSymbol"/>
+      </w:rPr>
+    </w:lvl>
+    <w:lvl w:ilvl="8">
+      <w:start w:val="1"/>
+      <w:numFmt w:val="bullet"/>
+      <w:lvlText w:val="▪"/>
+      <w:lvlJc w:val="left"/>
+      <w:pPr>
+        <w:tabs>
+          <w:tab w:val="num" w:pos="3600"/>
+        </w:tabs>
+        <w:ind w:left="3600" w:hanging="360"/>
+      </w:pPr>
+      <w:rPr>
+        <w:rFonts w:ascii="OpenSymbol" w:hAnsi="OpenSymbol" w:cs="OpenSymbol" w:hint="default"/>
+        <w:rFonts w:cs="OpenSymbol"/>
+      </w:rPr>
+    </w:lvl>
+  </w:abstractNum>
+  <w:abstractNum w:abstractNumId="4">
+    <w:lvl w:ilvl="0">
+      <w:start w:val="1"/>
+      <w:numFmt w:val="bullet"/>
+      <w:lvlText w:val=""/>
+      <w:lvlJc w:val="left"/>
+      <w:pPr>
+        <w:tabs>
+          <w:tab w:val="num" w:pos="720"/>
+        </w:tabs>
+        <w:ind w:left="720" w:hanging="360"/>
+      </w:pPr>
+      <w:rPr>
+        <w:rFonts w:ascii="Symbol" w:hAnsi="Symbol" w:cs="Symbol" w:hint="default"/>
+        <w:rFonts w:cs="OpenSymbol"/>
+      </w:rPr>
+    </w:lvl>
+    <w:lvl w:ilvl="1">
+      <w:start w:val="1"/>
+      <w:numFmt w:val="bullet"/>
+      <w:lvlText w:val="◦"/>
+      <w:lvlJc w:val="left"/>
+      <w:pPr>
+        <w:tabs>
+          <w:tab w:val="num" w:pos="1080"/>
+        </w:tabs>
+        <w:ind w:left="1080" w:hanging="360"/>
+      </w:pPr>
+      <w:rPr>
+        <w:rFonts w:ascii="OpenSymbol" w:hAnsi="OpenSymbol" w:cs="OpenSymbol" w:hint="default"/>
+        <w:rFonts w:cs="OpenSymbol"/>
+      </w:rPr>
+    </w:lvl>
+    <w:lvl w:ilvl="2">
+      <w:start w:val="1"/>
+      <w:numFmt w:val="bullet"/>
+      <w:lvlText w:val="▪"/>
+      <w:lvlJc w:val="left"/>
+      <w:pPr>
+        <w:tabs>
+          <w:tab w:val="num" w:pos="1440"/>
+        </w:tabs>
+        <w:ind w:left="1440" w:hanging="360"/>
+      </w:pPr>
+      <w:rPr>
+        <w:rFonts w:ascii="OpenSymbol" w:hAnsi="OpenSymbol" w:cs="OpenSymbol" w:hint="default"/>
+        <w:rFonts w:cs="OpenSymbol"/>
+      </w:rPr>
+    </w:lvl>
+    <w:lvl w:ilvl="3">
+      <w:start w:val="1"/>
+      <w:numFmt w:val="bullet"/>
+      <w:lvlText w:val=""/>
+      <w:lvlJc w:val="left"/>
+      <w:pPr>
+        <w:tabs>
+          <w:tab w:val="num" w:pos="1800"/>
+        </w:tabs>
+        <w:ind w:left="1800" w:hanging="360"/>
+      </w:pPr>
+      <w:rPr>
+        <w:rFonts w:ascii="Symbol" w:hAnsi="Symbol" w:cs="Symbol" w:hint="default"/>
+        <w:rFonts w:cs="OpenSymbol"/>
+      </w:rPr>
+    </w:lvl>
+    <w:lvl w:ilvl="4">
+      <w:start w:val="1"/>
+      <w:numFmt w:val="bullet"/>
+      <w:lvlText w:val="◦"/>
+      <w:lvlJc w:val="left"/>
+      <w:pPr>
+        <w:tabs>
+          <w:tab w:val="num" w:pos="2160"/>
+        </w:tabs>
+        <w:ind w:left="2160" w:hanging="360"/>
+      </w:pPr>
+      <w:rPr>
+        <w:rFonts w:ascii="OpenSymbol" w:hAnsi="OpenSymbol" w:cs="OpenSymbol" w:hint="default"/>
+        <w:rFonts w:cs="OpenSymbol"/>
+      </w:rPr>
+    </w:lvl>
+    <w:lvl w:ilvl="5">
+      <w:start w:val="1"/>
+      <w:numFmt w:val="bullet"/>
+      <w:lvlText w:val="▪"/>
+      <w:lvlJc w:val="left"/>
+      <w:pPr>
+        <w:tabs>
+          <w:tab w:val="num" w:pos="2520"/>
+        </w:tabs>
+        <w:ind w:left="2520" w:hanging="360"/>
+      </w:pPr>
+      <w:rPr>
+        <w:rFonts w:ascii="OpenSymbol" w:hAnsi="OpenSymbol" w:cs="OpenSymbol" w:hint="default"/>
+        <w:rFonts w:cs="OpenSymbol"/>
+      </w:rPr>
+    </w:lvl>
+    <w:lvl w:ilvl="6">
+      <w:start w:val="1"/>
+      <w:numFmt w:val="bullet"/>
+      <w:lvlText w:val=""/>
+      <w:lvlJc w:val="left"/>
+      <w:pPr>
+        <w:tabs>
+          <w:tab w:val="num" w:pos="2880"/>
+        </w:tabs>
+        <w:ind w:left="2880" w:hanging="360"/>
+      </w:pPr>
+      <w:rPr>
+        <w:rFonts w:ascii="Symbol" w:hAnsi="Symbol" w:cs="Symbol" w:hint="default"/>
+        <w:rFonts w:cs="OpenSymbol"/>
+      </w:rPr>
+    </w:lvl>
+    <w:lvl w:ilvl="7">
+      <w:start w:val="1"/>
+      <w:numFmt w:val="bullet"/>
+      <w:lvlText w:val="◦"/>
+      <w:lvlJc w:val="left"/>
+      <w:pPr>
+        <w:tabs>
+          <w:tab w:val="num" w:pos="3240"/>
+        </w:tabs>
+        <w:ind w:left="3240" w:hanging="360"/>
+      </w:pPr>
+      <w:rPr>
+        <w:rFonts w:ascii="OpenSymbol" w:hAnsi="OpenSymbol" w:cs="OpenSymbol" w:hint="default"/>
+        <w:rFonts w:cs="OpenSymbol"/>
+      </w:rPr>
+    </w:lvl>
+    <w:lvl w:ilvl="8">
+      <w:start w:val="1"/>
+      <w:numFmt w:val="bullet"/>
+      <w:lvlText w:val="▪"/>
+      <w:lvlJc w:val="left"/>
+      <w:pPr>
+        <w:tabs>
+          <w:tab w:val="num" w:pos="3600"/>
+        </w:tabs>
+        <w:ind w:left="3600" w:hanging="360"/>
+      </w:pPr>
+      <w:rPr>
+        <w:rFonts w:ascii="OpenSymbol" w:hAnsi="OpenSymbol" w:cs="OpenSymbol" w:hint="default"/>
+        <w:rFonts w:cs="OpenSymbol"/>
+      </w:rPr>
+    </w:lvl>
+  </w:abstractNum>
+  <w:abstractNum w:abstractNumId="5">
     <w:lvl w:ilvl="0">
       <w:start w:val="1"/>
       <w:numFmt w:val="none"/>
@@ -1413,6 +2859,15 @@
   </w:num>
   <w:num w:numId="2">
     <w:abstractNumId w:val="2"/>
+  </w:num>
+  <w:num w:numId="3">
+    <w:abstractNumId w:val="3"/>
+  </w:num>
+  <w:num w:numId="4">
+    <w:abstractNumId w:val="4"/>
+  </w:num>
+  <w:num w:numId="5">
+    <w:abstractNumId w:val="5"/>
   </w:num>
 </w:numbering>
 </file>
@@ -1423,7 +2878,6 @@
     <w:rPrDefault>
       <w:rPr>
         <w:rFonts w:ascii="Calibri" w:hAnsi="Calibri" w:eastAsia="Calibri" w:cs="" w:asciiTheme="minorHAnsi" w:cstheme="minorBidi" w:eastAsiaTheme="minorHAnsi" w:hAnsiTheme="minorHAnsi"/>
-        <w:sz w:val="22"/>
         <w:szCs w:val="22"/>
         <w:lang w:val="es-AR" w:eastAsia="en-US" w:bidi="ar-SA"/>
       </w:rPr>
@@ -1888,6 +3342,76 @@
       <w:rFonts w:cs="Courier New"/>
     </w:rPr>
   </w:style>
+  <w:style w:type="character" w:styleId="ListLabel4">
+    <w:name w:val="ListLabel 4"/>
+    <w:qFormat/>
+    <w:rPr>
+      <w:rFonts w:ascii="Times New Roman" w:hAnsi="Times New Roman" w:cs="Symbol"/>
+    </w:rPr>
+  </w:style>
+  <w:style w:type="character" w:styleId="ListLabel5">
+    <w:name w:val="ListLabel 5"/>
+    <w:qFormat/>
+    <w:rPr>
+      <w:rFonts w:cs="Courier New"/>
+    </w:rPr>
+  </w:style>
+  <w:style w:type="character" w:styleId="ListLabel6">
+    <w:name w:val="ListLabel 6"/>
+    <w:qFormat/>
+    <w:rPr>
+      <w:rFonts w:cs="Wingdings"/>
+    </w:rPr>
+  </w:style>
+  <w:style w:type="character" w:styleId="ListLabel7">
+    <w:name w:val="ListLabel 7"/>
+    <w:qFormat/>
+    <w:rPr>
+      <w:rFonts w:cs="Symbol"/>
+    </w:rPr>
+  </w:style>
+  <w:style w:type="character" w:styleId="ListLabel8">
+    <w:name w:val="ListLabel 8"/>
+    <w:qFormat/>
+    <w:rPr>
+      <w:rFonts w:cs="Courier New"/>
+    </w:rPr>
+  </w:style>
+  <w:style w:type="character" w:styleId="ListLabel9">
+    <w:name w:val="ListLabel 9"/>
+    <w:qFormat/>
+    <w:rPr>
+      <w:rFonts w:cs="Wingdings"/>
+    </w:rPr>
+  </w:style>
+  <w:style w:type="character" w:styleId="ListLabel10">
+    <w:name w:val="ListLabel 10"/>
+    <w:qFormat/>
+    <w:rPr>
+      <w:rFonts w:cs="Symbol"/>
+    </w:rPr>
+  </w:style>
+  <w:style w:type="character" w:styleId="ListLabel11">
+    <w:name w:val="ListLabel 11"/>
+    <w:qFormat/>
+    <w:rPr>
+      <w:rFonts w:cs="Courier New"/>
+    </w:rPr>
+  </w:style>
+  <w:style w:type="character" w:styleId="ListLabel12">
+    <w:name w:val="ListLabel 12"/>
+    <w:qFormat/>
+    <w:rPr>
+      <w:rFonts w:cs="Wingdings"/>
+    </w:rPr>
+  </w:style>
+  <w:style w:type="character" w:styleId="Bullets">
+    <w:name w:val="Bullets"/>
+    <w:qFormat/>
+    <w:rPr>
+      <w:rFonts w:ascii="OpenSymbol" w:hAnsi="OpenSymbol" w:eastAsia="OpenSymbol" w:cs="OpenSymbol"/>
+    </w:rPr>
+  </w:style>
   <w:style w:type="paragraph" w:styleId="Heading">
     <w:name w:val="Heading"/>
     <w:basedOn w:val="Normal"/>

</xml_diff>